<commit_message>
updated the nfr id's
updated the nfr id's
</commit_message>
<xml_diff>
--- a/Docs/PED/PED v1.1.docx
+++ b/Docs/PED/PED v1.1.docx
@@ -2425,7 +2425,13 @@
         <w:spacing w:before="60" w:after="60" w:line="240" w:lineRule="auto"/>
       </w:pPr>
       <w:r>
-        <w:t>NFR - Usability: first-time requester submits without training in ≤ 5 steps /5 min.</w:t>
+        <w:t>NFR</w:t>
+      </w:r>
+      <w:r>
+        <w:t>-001</w:t>
+      </w:r>
+      <w:r>
+        <w:t xml:space="preserve"> - Usability: first-time requester submits without training in ≤ 5 steps /5 min.</w:t>
       </w:r>
     </w:p>
     <w:p>
@@ -2451,7 +2457,13 @@
         <w:spacing w:before="60" w:after="60" w:line="240" w:lineRule="auto"/>
       </w:pPr>
       <w:r>
-        <w:t>NFR - Feedback timelines: status/feedback visible within 15 seconds of a staff change.</w:t>
+        <w:t>NFR</w:t>
+      </w:r>
+      <w:r>
+        <w:t>-002</w:t>
+      </w:r>
+      <w:r>
+        <w:t xml:space="preserve"> - Feedback timelines: status/feedback visible within 15 seconds of a staff change.</w:t>
       </w:r>
     </w:p>
     <w:p>
@@ -2464,7 +2476,13 @@
         <w:spacing w:before="60" w:after="60" w:line="240" w:lineRule="auto"/>
       </w:pPr>
       <w:r>
-        <w:t>NFR - Privacy: a requester can never see another's request (supports AC-004.2).</w:t>
+        <w:t>NFR</w:t>
+      </w:r>
+      <w:r>
+        <w:t>-003</w:t>
+      </w:r>
+      <w:r>
+        <w:t xml:space="preserve"> - Privacy: a requester can never see another's request (supports AC-004.2).</w:t>
       </w:r>
     </w:p>
     <w:p>

</xml_diff>